<commit_message>
Sunting bahasa 4 DPJ via skill naskah-id (EYD V + KBBI + kalimat efektif)
- periksa.py: 0 temuan K & AI di 4 markdown; evaluator GEPA 4/4 skor 1.0
- 46x koma sebelum 'sehingga/karena' (EJ-10), et al.->dkk. 46x,
  kata baku (kontinu, entropi, rupiah), kata depan 'per' terpisah 21x
- kalke Inggris diperbaiki (kecil-kecil banyak, kontak-less, dewasa-ke-anak,
  lintas-person, ter-update->diperbarui), nominalisasi, verba tujuan konkret
- DOCX regenerasi + verifikasi sinkron pandoc 4/4 identik; PDF 15/14/14/16 hal
- CATATAN-PERUBAHAN.md + arsip skill naskah-id
</commit_message>
<xml_diff>
--- a/03-dpj/DPJ-1_Proposal_Judul_Kandang_Ayam_Broiler.docx
+++ b/03-dpj/DPJ-1_Proposal_Judul_Kandang_Ayam_Broiler.docx
@@ -188,7 +188,7 @@
           <w:sz w:val="24"/>
           <w:szCs w:val="24"/>
         </w:rPr>
-        <w:t xml:space="preserve">Perkembangan teknologi telah memengaruhi berbagai aktivitas peternakan, termasuk cara peternak memantau kondisi kawanan unggas yang dipeliharanya. Saat ini, peternakan skala kecil dan menengah dituntut meningkatkan efisiensi produksi di tengah keterbatasan tenaga kerja, sementara penyakit unggas masih sering terdeteksi terlambat. Keterlambatan deteksi menyebabkan penyebaran ke seluruh kawanan, kenaikan mortalitas, dan kerugian ekonomi yang berarti bagi peternak rakyat yang mengelola 10 hingga 50 ekor per siklus. Tinjauan sistematis He et al. (2022) menunjukkan bahwa peringatan dini penyakit ayam selama ini bertumpu pada pemantauan gejala klinis, dan seluruh moda pemantauan otomatis yang tersedia mengandalkan kamera atau sensor lekat yang mahal serta rumit bagi peternak kecil [9]. Kondisi tersebut menunjukkan bahwa dibutuhkan metode pemantauan yang murah, tanpa kamera saat operasi, dan tidak menuntut pemasangan perangkat pada tiap ekor.</w:t>
+        <w:t xml:space="preserve">Perkembangan teknologi telah memengaruhi berbagai aktivitas peternakan, termasuk cara peternak memantau kondisi kawanan unggas yang dipeliharanya. Saat ini, peternakan skala kecil dan menengah dituntut meningkatkan efisiensi produksi di tengah keterbatasan tenaga kerja, sementara penyakit unggas masih sering terdeteksi terlambat. Keterlambatan deteksi menyebabkan penyebaran ke seluruh kawanan, kenaikan mortalitas, dan kerugian ekonomi yang berarti bagi peternak rakyat yang mengelola 10 hingga 50 ekor per siklus. Tinjauan sistematis He dkk. (2022) menunjukkan bahwa peringatan dini penyakit ayam selama ini bertumpu pada pemantauan gejala klinis, dan seluruh moda pemantauan otomatis yang tersedia mengandalkan kamera atau sensor lekat yang mahal serta rumit bagi peternak kecil [9]. Kondisi tersebut menunjukkan bahwa dibutuhkan metode pemantauan yang murah, tanpa kamera saat operasi, dan tidak menuntut pemasangan perangkat pada tiap ekor.</w:t>
       </w:r>
     </w:p>
     <w:p>
@@ -204,7 +204,7 @@
           <w:sz w:val="24"/>
           <w:szCs w:val="24"/>
         </w:rPr>
-        <w:t xml:space="preserve">Wi-Fi Channel State Information (CSI) merupakan jalur teknologi yang menawarkan alternatif atas moda tersebut. CSI adalah data per-subcarrier yang melaporkan bagaimana sinyal Wi-Fi termodulasi oleh lingkungan fisik, sehingga gerakan benda di antara pemancar dan penerima meninggalkan jejak yang terukur pada amplitudo dan fase sinyal. Ma et al. (2019) menjelaskan bahwa keluarga aplikasi sensing Wi-Fi telah mencakup pengenalan aktivitas, deteksi jatuh, dan estimasi respirasi manusia [1]. Hernandez dan Bulut (2020) menunjukkan bahwa sensing Wi-Fi berbasis CSI dapat dijalankan pada perangkat murah kelas Internet of Things, sehingga hambatan biaya perangkat keras semakin rendah [2]. Pada penelitian ini, CSI digunakan untuk membaca jejak gerak kolektif kawanan ayam broiler tanpa kamera dan tanpa perangkat lekat.</w:t>
+        <w:t xml:space="preserve">Wi-Fi Channel State Information (CSI) merupakan jalur teknologi yang menawarkan alternatif atas moda tersebut. CSI adalah data per subcarrier yang melaporkan bagaimana sinyal Wi-Fi termodulasi oleh lingkungan fisik sehingga gerakan benda di antara pemancar dan penerima meninggalkan jejak yang terukur pada amplitudo dan fase sinyal. Ma dkk. (2019) menjelaskan bahwa keluarga aplikasi sensing Wi-Fi telah mencakup pengenalan aktivitas, deteksi jatuh, dan estimasi respirasi manusia [1]. Hernandez dan Bulut (2020) menunjukkan bahwa sensing Wi-Fi berbasis CSI dapat dijalankan pada perangkat murah kelas Internet of Things sehingga hambatan biaya perangkat keras semakin rendah [2]. Pada penelitian ini, CSI digunakan untuk membaca jejak gerak kolektif kawanan ayam broiler tanpa kamera dan tanpa perangkat lekat.</w:t>
       </w:r>
     </w:p>
     <w:p>
@@ -220,7 +220,7 @@
           <w:sz w:val="24"/>
           <w:szCs w:val="24"/>
         </w:rPr>
-        <w:t xml:space="preserve">Pada hewan ternak besar, kemampuan CSI telah terbukti pada lingkungan kandang nyata. Hao et al. (2019) memantau respirasi babi menggunakan informasi kanal jaringan Wi-Fi [3], Lu et al. (2019) melanjutkan pemantauan frekuensi respirasi babi dengan teknologi wireless sensing [4], dan Hao et al. (2020) mengenali perilaku mounting sapi perlah dari sinyal Wi-Fi dengan ribuan sampel uji [5]. Ketiganya bekerja pada satu sampai dua hewan bermassa besar per area, sehingga masih membuka pertanyaan apakah pendekatan yang sama dapat bekerja pada kawanan unggas yang jauh lebih kecil massanya dan jauh lebih banyak jumlahnya. Pencarian literatur yang dilakukan sebelum penyusunan proposal ini tidak menemukan satu pun publikasi Wi-Fi CSI pada unggas, termasuk pada tinjauan peringatan dini penyakit ayam yang menyebut tiga moda utama tanpa menyebut Wi-Fi [9]. Pemantauan broiler hingga kini didominasi akselerometer lekat [6], computer vision [7] [8], sehingga penerapan CSI pada kawanan unggas merupakan wilayah yang belum dipetakan.</w:t>
+        <w:t xml:space="preserve">Pada hewan ternak besar, kemampuan CSI telah terbukti pada lingkungan kandang nyata. Hao dkk. (2019) memantau respirasi babi menggunakan informasi kanal jaringan Wi-Fi [3], Lu dkk. (2019) melanjutkan pemantauan frekuensi respirasi babi dengan teknologi wireless sensing [4], dan Hao dkk. (2020) mengenali perilaku mounting sapi perlah dari sinyal Wi-Fi dengan ribuan sampel uji [5]. Ketiganya bekerja pada satu sampai dua hewan bermassa besar per area sehingga masih membuka pertanyaan apakah pendekatan yang sama dapat bekerja pada kawanan unggas yang jauh lebih kecil massanya dan jauh lebih banyak jumlahnya. Pencarian literatur yang dilakukan sebelum penyusunan proposal ini tidak menemukan satu pun publikasi Wi-Fi CSI pada unggas, termasuk pada tinjauan peringatan dini penyakit ayam yang menyebut tiga moda utama tanpa menyebut Wi-Fi [9]. Pemantauan broiler hingga kini didominasi akselerometer lekat [6], computer vision [7] [8] sehingga penerapan CSI pada kawanan unggas merupakan wilayah yang belum dipetakan.</w:t>
       </w:r>
     </w:p>
     <w:p>
@@ -236,7 +236,7 @@
           <w:sz w:val="24"/>
           <w:szCs w:val="24"/>
         </w:rPr>
-        <w:t xml:space="preserve">Rencana awal penelitian ini yang menjanjikan deteksi dini penyakit per-ekor telah direview secara kritis dan dinyatakan tidak defensibel. Ada tiga alasan struktural. Pertama, fisika sinyal: satu ayam sakit di kawanan 30 ekor hanya menyumbang sekitar 2 hingga 10 persen gangguan total, dan amplitudo Doppler skala dengan massa tubuh sehingga broiler dua kilogram menghasilkan gangguan puluhan kali lebih lemah daripada ternak besar. Kedua, tidak ada kelas positif: contoh ayam sakit terverifikasi tidak akan tersedia dalam satu semester, sehingga metrik klasifikasi seperti macro F1 tinggi tidak terdefinisi secara metodologis. Ketiga, atribusi individu tidak mungkin tanpa kamera pada setiap ekor. Konsekuensinya, unit analisis harus digeser dari individu ke kawanan, dan target pengukuran harus digeser dari deteksi penyakit ke estimasi indeks aktivitas kolektif.</w:t>
+        <w:t xml:space="preserve">Rencana awal penelitian ini yang menjanjikan deteksi dini penyakit per ekor telah direview secara kritis dan dinyatakan tidak defensibel. Ada tiga alasan struktural. Pertama, fisika sinyal: satu ayam sakit di kawanan 30 ekor hanya menyumbang sekitar 2 hingga 10 persen gangguan total, dan amplitudo Doppler skala dengan massa tubuh sehingga broiler dua kilogram menghasilkan gangguan puluhan kali lebih lemah daripada ternak besar. Kedua, tidak ada kelas positif: contoh ayam sakit terverifikasi tidak akan tersedia dalam satu semester sehingga metrik klasifikasi seperti macro F1 tinggi tidak terdefinisi secara metodologis. Ketiga, atribusi individu tidak mungkin tanpa kamera pada setiap ekor. Konsekuensinya, unit analisis harus digeser dari individu ke kawanan, dan target pengukuran harus digeser dari deteksi penyakit ke estimasi indeks aktivitas kolektif.</w:t>
       </w:r>
     </w:p>
     <w:p>
@@ -745,7 +745,7 @@
           <w:sz w:val="24"/>
           <w:szCs w:val="24"/>
         </w:rPr>
-        <w:t xml:space="preserve">Berdasarkan latar belakang permasalahan yang telah diuraikan serta untuk menjawab permasalahan yang menjadi fokus dalam penelitian ini, maka dapat dirumuskan beberapa rumusan masalah yang akan dikaji lebih lanjut. Rumusan masalah pada penelitian ini sebagai berikut.</w:t>
+        <w:t xml:space="preserve">Berdasarkan latar belakang permasalahan yang telah diuraikan serta untuk menjawab permasalahan yang menjadi fokus dalam penelitian ini, maka dapat dirumuskan beberapa rumusan masalah yang akan dikaji lebih lanjut. Rumusan masalah pada penelitian ini adalah sebagai berikut.</w:t>
       </w:r>
     </w:p>
     <w:p>
@@ -826,7 +826,7 @@
           <w:sz w:val="24"/>
           <w:szCs w:val="24"/>
         </w:rPr>
-        <w:t xml:space="preserve">Penelitian ini bertujuan untuk menguji kelayakan estimasi indeks aktivitas kawanan broiler berbasis Wi-Fi CSI pada ESP32 sebagai dasar peringatan dini perubahan kondisi kawanan. Adapun tujuan dari penelitian ini adalah sebagai berikut.</w:t>
+        <w:t xml:space="preserve">Penelitian ini bertujuan menguji kelayakan estimasi indeks aktivitas kawanan broiler berbasis Wi-Fi CSI pada ESP32 sebagai dasar peringatan dini perubahan kondisi kawanan. Adapun tujuan dari penelitian ini adalah sebagai berikut.</w:t>
       </w:r>
     </w:p>
     <w:p>
@@ -858,7 +858,7 @@
           <w:sz w:val="24"/>
           <w:szCs w:val="24"/>
         </w:rPr>
-        <w:t xml:space="preserve">2. Mengimplementasikan indeks aktivitas kawanan kontinyu dari energi motion-band amplitudo CSI dengan window 60 detik dan memvalidasinya terhadap referensi kamera sinkron.</w:t>
+        <w:t xml:space="preserve">2. Mengimplementasikan indeks aktivitas kawanan kontinu dari energi motion-band amplitudo CSI dengan window 60 detik dan memvalidasinya terhadap referensi kamera sinkron.</w:t>
       </w:r>
     </w:p>
     <w:p>
@@ -874,7 +874,7 @@
           <w:sz w:val="24"/>
           <w:szCs w:val="24"/>
         </w:rPr>
-        <w:t xml:space="preserve">3. Mengetahui hasil pengujian control chart z-score adaptif dalam mendeteksi perubahan pola kawanan melalui metrik alarm palsu per 24 jam dan precision@k, serta menyusun protokol pengukuran dan dataset awal yang terdokumentasi untuk penelitian lanjutan.</w:t>
+        <w:t xml:space="preserve">3. Menguji control chart z-score adaptif dalam mendeteksi perubahan pola kawanan melalui metrik alarm palsu per 24 jam dan precision@k, serta menyusun protokol pengukuran dan dataset awal yang terdokumentasi untuk penelitian lanjutan.</w:t>
       </w:r>
     </w:p>
     <w:p>
@@ -907,7 +907,7 @@
           <w:sz w:val="24"/>
           <w:szCs w:val="24"/>
         </w:rPr>
-        <w:t xml:space="preserve">Agar penelitian ini memiliki ruang lingkup yang jelas dan terarah sesuai dengan tujuan yang telah ditetapkan, maka ditentukan batasan masalah guna membatasi pembahasan terhadap aspek-aspek yang relevan dengan topik penelitian. Adapun batasan masalah pada penelitian ini sebagai berikut.</w:t>
+        <w:t xml:space="preserve">Agar penelitian ini memiliki ruang lingkup yang jelas dan terarah sesuai dengan tujuan yang telah ditetapkan, maka ditentukan batasan masalah guna membatasi pembahasan terhadap aspek-aspek yang relevan dengan topik penelitian. Adapun batasan masalah pada penelitian ini adalah sebagai berikut.</w:t>
       </w:r>
     </w:p>
     <w:p>
@@ -923,7 +923,7 @@
           <w:sz w:val="24"/>
           <w:szCs w:val="24"/>
         </w:rPr>
-        <w:t xml:space="preserve">1. Unit analisis adalah kawanan 10 hingga 15 ekor broiler dalam satu kandang mitra 【lokasi kandang】 dengan siklus pemeliharaan normal, bukan ayam per-ekor.</w:t>
+        <w:t xml:space="preserve">1. Unit analisis adalah kawanan 10 hingga 15 ekor broiler dalam satu kandang mitra 【lokasi kandang】 dengan siklus pemeliharaan normal, bukan ayam per ekor.</w:t>
       </w:r>
     </w:p>
     <w:p>
@@ -971,7 +971,7 @@
           <w:sz w:val="24"/>
           <w:szCs w:val="24"/>
         </w:rPr>
-        <w:t xml:space="preserve">4. Objek terbatas pada satu kandang mitra, sehingga desain evaluasi memakai split blok-waktu (latih pada hari A sampai B, uji pada hari C) untuk mengelola risiko pseudoreplikasi.</w:t>
+        <w:t xml:space="preserve">4. Objek terbatas pada satu kandang mitra sehingga desain evaluasi memakai split blok waktu (latih pada hari A sampai B, uji pada hari C) untuk mengelola risiko pseudoreplikasi.</w:t>
       </w:r>
     </w:p>
     <w:p>
@@ -1003,7 +1003,7 @@
           <w:sz w:val="24"/>
           <w:szCs w:val="24"/>
         </w:rPr>
-        <w:t xml:space="preserve">6. Penelitian ini tidak membahas identifikasi ayam per-ekor, diagnosis penyakit, pengukuran fisiologi per-ekor seperti denyut jantung unggas, maupun perluasan ke kandang skala industri.</w:t>
+        <w:t xml:space="preserve">6. Penelitian ini tidak membahas identifikasi ayam per ekor, diagnosis penyakit, pengukuran fisiologi per ekor seperti denyut jantung unggas, maupun perluasan ke kandang skala industri.</w:t>
       </w:r>
     </w:p>
     <w:p>
@@ -1036,7 +1036,7 @@
           <w:sz w:val="24"/>
           <w:szCs w:val="24"/>
         </w:rPr>
-        <w:t xml:space="preserve">Penerapan sensing Wi-Fi pada kawanan unggas kecil-kecil banyak merupakan wilayah yang belum terpetakan sehingga hasil penelitian ini berpotensi menjadi rujukan bagi kajian lanjutan. Proses pengujian yang bergerbang juga memberi contoh tata kelola risiko dan kejujuran metrik pada penelitian tugas akhir. Manfaat penelitian ini diuraikan sebagai berikut.</w:t>
+        <w:t xml:space="preserve">Penerapan sensing Wi-Fi pada kawanan unggas berbadan kecil dan berjumlah banyak merupakan wilayah yang belum terpetakan sehingga hasil penelitian ini berpotensi menjadi rujukan bagi kajian lanjutan. Proses pengujian yang bergerbang juga memberi contoh tata kelola risiko dan kejujuran metrik pada penelitian tugas akhir. Manfaat penelitian ini diuraikan sebagai berikut.</w:t>
       </w:r>
     </w:p>
     <w:p>
@@ -1105,7 +1105,7 @@
           <w:sz w:val="24"/>
           <w:szCs w:val="24"/>
         </w:rPr>
-        <w:t xml:space="preserve">Wi-Fi Channel State Information (CSI) merupakan informasi per-subcarrier yang menggambarkan bagaimana sinyal Wi-Fi merambat dari pemancar ke penerima, mencakup amplitudo dan fase pada tiap subcarrier. Ketika orang, hewan, atau benda bergerak di antara kedua node, jalur pantulan sinyal berubah sehingga pola CSI ikut berubah; perubahan inilah yang dimanfaatkan sebagai sumber data sensing. Ma et al. (2019) menjelaskan bahwa keluarga aplikasi sensing Wi-Fi berbasis CSI mencakup pengenalan aktivitas, deteksi jatuh, estimasi respirasi, dan lokalisasi, dengan tantangan umum berupa sensitivitas lingkungan dan kebutuhan kalibrasi [1]. Karakteristik tersebut menempatkan CSI sebagai sensor tidak kasatmata yang tidak memerlukan kamera maupun perangkat yang dikenakan pada objek, sehingga sesuai untuk kandang yang padat dan lembap seperti pada penelitian ini.</w:t>
+        <w:t xml:space="preserve">Wi-Fi Channel State Information (CSI) merupakan informasi per subcarrier yang menggambarkan bagaimana sinyal Wi-Fi merambat dari pemancar ke penerima, mencakup amplitudo dan fase pada tiap subcarrier. Ketika orang, hewan, atau benda bergerak di antara kedua node, jalur pantulan sinyal berubah sehingga pola CSI ikut berubah; perubahan inilah yang dimanfaatkan sebagai sumber data sensing. Ma dkk. (2019) menjelaskan bahwa keluarga aplikasi sensing Wi-Fi berbasis CSI mencakup pengenalan aktivitas, deteksi jatuh, estimasi respirasi, dan lokalisasi, dengan tantangan umum berupa sensitivitas lingkungan dan kebutuhan kalibrasi [1]. Karakteristik tersebut menempatkan CSI sebagai sensor tidak kasatmata yang tidak memerlukan kamera maupun perangkat yang dikenakan pada objek sehingga sesuai untuk kandang yang padat dan lembap seperti pada penelitian ini.</w:t>
       </w:r>
     </w:p>
     <w:p>
@@ -1138,7 +1138,7 @@
           <w:sz w:val="24"/>
           <w:szCs w:val="24"/>
         </w:rPr>
-        <w:t xml:space="preserve">ESP32 merupakan mikrokontroler murah dengan konektivitas Wi-Fi bawaan yang menyediakan akses CSI pada firmware khusus. Hernandez dan Bulut (2020) menunjukkan bahwa sensing Wi-Fi mandiri dapat berjalan penuh pada perangkat kelas IoT tanpa laptop atau kartu jaringan kelas riset, sehingga biaya per node sensing menjadi sangat rendah [2]. Kemampuan ini menjadi dasar pemilihan ESP32 sebagai perangkat capture pada penelitian ini: tiga node (satu access point, dua station) dapat dipasang mengapit area kawanan dengan anggaran yang masih terjangkau bagi mahasiswa. Dengan perangkat murah tersebut, replikasi protokol pengukuran oleh peneliti lain atau peternak lain juga menjadi lebih realistis.</w:t>
+        <w:t xml:space="preserve">ESP32 merupakan mikrokontroler murah dengan konektivitas Wi-Fi bawaan yang menyediakan akses CSI pada firmware khusus. Hernandez dan Bulut (2020) menunjukkan bahwa sensing Wi-Fi mandiri dapat berjalan penuh pada perangkat kelas IoT tanpa laptop atau kartu jaringan kelas riset sehingga biaya per node sensing menjadi sangat rendah [2]. Kemampuan ini menjadi dasar pemilihan ESP32 sebagai perangkat capture pada penelitian ini: tiga node (satu access point, dua station) dapat dipasang mengapit area kawanan dengan anggaran yang masih terjangkau bagi mahasiswa. Dengan perangkat murah tersebut, replikasi protokol pengukuran oleh peneliti lain atau peternak lain juga menjadi lebih realistis.</w:t>
       </w:r>
     </w:p>
     <w:p>
@@ -1187,7 +1187,7 @@
           <w:sz w:val="24"/>
           <w:szCs w:val="24"/>
         </w:rPr>
-        <w:t xml:space="preserve">Tabel 2.1 memetakan fitur RuView yang dipakai beserta status keterujinya, agar janji teknis proposal ini selalu berada di atas fitur yang benar-benar terukur. Dua hal jujur perlu dicatat sejak awal. Pertama, filter bandpass napas dan jantung pada RuView memiliki rentang yang dikodekan permanen untuk manusia pada semua lapisan; bila penelitian melanjutkan ke estimasi napas unggas, konstanta filter wajib diubah di firmware dan server, dan denyut jantung ayam (250 hingga 330 denyut per menit) tidak mungkin diukur tanpa desain ulang filter. Kedua, fitur pose on-device pada RuView berstatus stub dengan kualitas terukur yang sangat rendah (PCK@20 sekitar 3 persen), sehingga tidak dijanjikan sama sekali dalam proposal ini.</w:t>
+        <w:t xml:space="preserve">Tabel 2.1 memetakan fitur RuView yang dipakai beserta status keterujinya, agar janji teknis proposal ini selalu berada di atas fitur yang benar-benar terukur. Dua catatan jujur perlu dicatat sejak awal. Pertama, filter bandpass napas dan jantung pada RuView memiliki rentang yang dikodekan permanen untuk manusia pada semua lapisan; bila penelitian melanjutkan ke estimasi napas unggas, konstanta filter wajib diubah di firmware dan server. Denyut jantung ayam (250 hingga 330 denyut per menit) bahkan tidak mungkin diukur tanpa desain ulang filter. Kedua, fitur pose on-device pada RuView berstatus stub dengan kualitas terukur yang sangat rendah (PCK@20 sekitar 3 persen) sehingga tidak dijanjikan sama sekali dalam proposal ini.</w:t>
       </w:r>
     </w:p>
     <w:p>
@@ -2286,7 +2286,7 @@
           <w:sz w:val="24"/>
           <w:szCs w:val="24"/>
         </w:rPr>
-        <w:t xml:space="preserve">Pemantauan broiler yang ada kini memakai moda lain di luar CSI. Yang et al. (2021) mengklasifikasi perilaku broiler dari akselerometer triaksial dengan machine learning [6]; Campbell et al. (2024) memantau aktivitas broiler komersial melalui clustering trajektori berbasis kamera [7]; dan Okinda et al. (2019) membangun sistem machine vision untuk deteksi dini burung sakit pada model broiler [8]. Ketiga moda ini menuntut biaya perangkat, pemeliharaan, atau kamera yang sulit bagi peternak kecil, dan ketiganya juga menegaskan bahwa indikator perilaku mendahului gejala klinis. Review He et al. (2022) merangkum kemajuan peringatan dini penyakit ayam dari gejala klinis dan menempatkan pemantauan otomatis sebagai arah penting [9]. Posisi penelitian ini adalah melengkapi moda tersebut dengan sensor yang tidak lekat dan tidak berkamera, dengan imbalan resolusi informasi yang lebih kasar pada tingkat kawanan.</w:t>
+        <w:t xml:space="preserve">Pemantauan broiler yang ada kini memakai moda lain di luar CSI. Yang dkk. (2021) mengklasifikasi perilaku broiler dari akselerometer triaksial dengan machine learning [6]; Campbell dkk. (2024) memantau aktivitas broiler komersial melalui clustering trajektori berbasis kamera [7]; dan Okinda dkk. (2019) membangun sistem machine vision untuk deteksi dini burung sakit pada model broiler [8]. Ketiga moda ini menuntut biaya perangkat, pemeliharaan, atau kamera yang sulit bagi peternak kecil, dan ketiganya juga menegaskan bahwa indikator perilaku mendahului gejala klinis. Review He dkk. (2022) merangkum kemajuan peringatan dini penyakit ayam dari gejala klinis dan menempatkan pemantauan otomatis sebagai arah penting [9]. Posisi penelitian ini adalah melengkapi moda tersebut dengan sensor yang tidak lekat dan tidak berkamera, dengan imbalan resolusi informasi yang lebih kasar pada tingkat kawanan.</w:t>
       </w:r>
     </w:p>
     <w:p>
@@ -2319,7 +2319,7 @@
           <w:sz w:val="24"/>
           <w:szCs w:val="24"/>
         </w:rPr>
-        <w:t xml:space="preserve">Kondisi penelitian ini tidak menyediakan contoh kegagalan yang berlabel, sehingga pendekatan evaluasi harus jujur terhadap keterbatasan tersebut. Antonini et al. (2023) membuktikan bahwa deteksi anomali tanpa supervisi dapat berjalan pada lingkungan industri ekstrem dengan sistem TinyML adaptif [10]. Pola pendekatan ini sejalan dengan kebutuhan penelitian ini: control chart dan z-score adaptif pada indeks aktivitas yang tidak memerlukan contoh kegagalan, dengan audit retrospektif kamera sebagai penilaian kualitas alarm. Strategi semacam ini umum dipakai pada pemantauan proses industri dan dapat ditransfer ke pemantauan aktivitas kawanan tanpa mengubah prinsip kerjanya.</w:t>
+        <w:t xml:space="preserve">Kondisi penelitian ini tidak menyediakan contoh kegagalan yang berlabel sehingga pendekatan evaluasi harus jujur terhadap keterbatasan tersebut. Antonini dkk. (2023) membuktikan bahwa deteksi anomali tanpa supervisi dapat berjalan pada lingkungan industri ekstrem dengan sistem TinyML adaptif [10]. Pola pendekatan tersebut sejalan dengan kebutuhan penelitian ini: control chart dan z-score adaptif pada indeks aktivitas yang tidak memerlukan contoh kegagalan, dengan audit retrospektif kamera sebagai penilaian kualitas alarm. Strategi semacam ini umum dipakai pada pemantauan proses industri dan dapat ditransfer ke pemantauan aktivitas kawanan tanpa mengubah prinsip kerjanya.</w:t>
       </w:r>
     </w:p>
     <w:p>
@@ -2352,7 +2352,7 @@
           <w:sz w:val="24"/>
           <w:szCs w:val="24"/>
         </w:rPr>
-        <w:t xml:space="preserve">Berdasarkan tabel perbandingan di atas, terlihat bahwa penelitian-penelitian sebelumnya terpisah pada dua kelompok: sensing CSI yang matang pada ternak besar per-individu, serta pemantauan unggas yang seluruhnya memakai sensor lekat atau kamera. Belum banyak penelitian yang secara spesifik menerapkan sensing CSI pada kawanan unggas kecil-kecil banyak dengan perangkat murah, terdapat juga beberapa celah masalah (gap) yang belum terselesaikan secara simultan oleh peneliti sebelumnya. Penelitian ini mengisi celah tersebut dengan langkah-langkah berikut.</w:t>
+        <w:t xml:space="preserve">Berdasarkan tabel perbandingan di atas, terlihat bahwa penelitian-penelitian sebelumnya terpisah pada dua kelompok: sensing CSI yang matang pada ternak besar per individu, serta pemantauan unggas yang seluruhnya memakai sensor lekat atau kamera. Belum banyak penelitian yang secara spesifik menerapkan sensing CSI pada kawanan unggas berbadan kecil dan berjumlah banyak dengan perangkat murah. Masih terdapat beberapa celah masalah (gap) yang belum terselesaikan secara simultan oleh peneliti sebelumnya. Penelitian ini mengisi celah tersebut dengan langkah-langkah berikut.</w:t>
       </w:r>
     </w:p>
     <w:p>
@@ -2384,7 +2384,7 @@
           <w:sz w:val="24"/>
           <w:szCs w:val="24"/>
         </w:rPr>
-        <w:t xml:space="preserve">2. Memakai perangkat murah ESP32 dan platform open-source RuView agar seluruh rantai capture hingga alert dapat direplikasi peternak dan peneliti lain.</w:t>
+        <w:t xml:space="preserve">2. Memakai perangkat murah ESP32 dan platform open-source RuView agar seluruh rantai capture hingga alert dapat direplikasi oleh peternak dan peneliti lain.</w:t>
       </w:r>
     </w:p>
     <w:p>
@@ -2651,7 +2651,7 @@
                 <w:sz w:val="21"/>
                 <w:szCs w:val="21"/>
               </w:rPr>
-              <w:t xml:space="preserve">Hao et al. (2019) — monitoring respirasi babi via CSI</w:t>
+              <w:t xml:space="preserve">Hao dkk. (2019) — monitoring respirasi babi via CSI</w:t>
             </w:r>
           </w:p>
         </w:tc>
@@ -2816,7 +2816,7 @@
                 <w:sz w:val="21"/>
                 <w:szCs w:val="21"/>
               </w:rPr>
-              <w:t xml:space="preserve">Lu et al. (2019) — frekuensi respirasi babi, wireless sensing</w:t>
+              <w:t xml:space="preserve">Lu dkk. (2019) — frekuensi respirasi babi, wireless sensing</w:t>
             </w:r>
           </w:p>
         </w:tc>
@@ -2981,7 +2981,7 @@
                 <w:sz w:val="21"/>
                 <w:szCs w:val="21"/>
               </w:rPr>
-              <w:t xml:space="preserve">Hao et al. (2020) — perilaku mounting sapi perah via Wi-Fi</w:t>
+              <w:t xml:space="preserve">Hao dkk. (2020) — perilaku mounting sapi perah via Wi-Fi</w:t>
             </w:r>
           </w:p>
         </w:tc>
@@ -3146,7 +3146,7 @@
                 <w:sz w:val="21"/>
                 <w:szCs w:val="21"/>
               </w:rPr>
-              <w:t xml:space="preserve">Yang et al. (2021) — klasifikasi perilaku broiler akselerometer</w:t>
+              <w:t xml:space="preserve">Yang dkk. (2021) — klasifikasi perilaku broiler akselerometer</w:t>
             </w:r>
           </w:p>
         </w:tc>
@@ -3311,7 +3311,7 @@
                 <w:sz w:val="21"/>
                 <w:szCs w:val="21"/>
               </w:rPr>
-              <w:t xml:space="preserve">Campbell et al. (2024) — aktivitas broiler via kamera</w:t>
+              <w:t xml:space="preserve">Campbell dkk. (2024) — aktivitas broiler via kamera</w:t>
             </w:r>
           </w:p>
         </w:tc>
@@ -3476,7 +3476,7 @@
                 <w:sz w:val="21"/>
                 <w:szCs w:val="21"/>
               </w:rPr>
-              <w:t xml:space="preserve">Okinda et al. (2019) — deteksi dini burung sakit, machine vision</w:t>
+              <w:t xml:space="preserve">Okinda dkk. (2019) — deteksi dini burung sakit, machine vision</w:t>
             </w:r>
           </w:p>
         </w:tc>
@@ -3869,7 +3869,7 @@
           <w:sz w:val="24"/>
           <w:szCs w:val="24"/>
         </w:rPr>
-        <w:t xml:space="preserve">Setiap tahap dirancang menghasilkan artefak tetap, mulai dari karakterisasi sinyal, protokol pengukuran, dataset awal, hingga laporan evaluasi, sehingga penelitian tetap bernilai sekalipun berhenti pada salah satu gerbang. Desain penelitian yang dipakai adalah studi kelayakan kuantitatif dengan gerbang go/no-go pada minggu ketiga; keputusan lanjut atau pivot diambil sebelum pipeline besar dibangun mengikuti prinsip bahwa biaya menemukan kelemahan di awal jauh lebih murah daripada di akhir.</w:t>
+        <w:t xml:space="preserve">Setiap tahap dirancang menghasilkan artefak tetap, mulai dari karakterisasi sinyal, protokol pengukuran, dataset awal, hingga laporan evaluasi sehingga penelitian tetap bernilai sekalipun berhenti pada salah satu gerbang. Desain penelitian yang dipakai adalah studi kelayakan kuantitatif dengan gerbang go/no-go pada minggu ketiga; keputusan lanjut atau pivot diambil sebelum pipeline besar dibangun mengikuti prinsip bahwa biaya menemukan kelemahan di awal jauh lebih murah daripada di akhir.</w:t>
       </w:r>
     </w:p>
     <w:p>
@@ -3902,7 +3902,7 @@
           <w:sz w:val="24"/>
           <w:szCs w:val="24"/>
         </w:rPr>
-        <w:t xml:space="preserve">Studi literatur dilakukan terhadap tiga kelompok sumber, yaitu sensing Wi-Fi berbasis CSI pada manusia dan ternak, pemantauan perilaku unggas, serta metode deteksi anomali tanpa label. Sumber diutamakan dari jurnal dan prosiding terindeks (ACM, IEEE, Elsevier, MDPI, Sensors) pada rentang 2014 hingga 2024. Setiap referensi yang dikutip diverifikasi keasliannya melalui API Crossref dengan mencocokkan judul, penulis, tahun, dan venue terhadap DOI yang terdaftar, sehingga tidak ada satu pun referensi fiktif dalam dokumen ini. Hasil studi literatur dikonsolidasikan pada Bab II dan menjadi dasar pemilihan metrik serta penetapan celah penelitian pada subbab 2.6.</w:t>
+        <w:t xml:space="preserve">Studi literatur dilakukan terhadap tiga kelompok sumber, yaitu sensing Wi-Fi berbasis CSI pada manusia dan ternak, pemantauan perilaku unggas, serta metode deteksi anomali tanpa label. Sumber diutamakan dari jurnal dan prosiding terindeks (ACM, IEEE, Elsevier, MDPI, Sensors) pada rentang 2014 hingga 2024. Setiap referensi yang dikutip diverifikasi keasliannya melalui API Crossref dengan mencocokkan judul, penulis, tahun, dan venue terhadap DOI yang terdaftar sehingga tidak ada satu pun referensi fiktif dalam dokumen ini. Hasil studi literatur dikonsolidasikan pada Bab II dan menjadi dasar pemilihan metrik serta penetapan celah penelitian pada subbab 2.6.</w:t>
       </w:r>
     </w:p>
     <w:p>
@@ -3935,7 +3935,7 @@
           <w:sz w:val="24"/>
           <w:szCs w:val="24"/>
         </w:rPr>
-        <w:t xml:space="preserve">Arsitektur sistem terdiri atas tiga lapisan. Lapisan sensing berisi tiga ESP32 (satu access point, dua station) yang dipasang TX-RX mengapit area kawanan agar geometri antena memotong zona Fresnel area bergerak; ketiganya mengirim frame CSI melalui UDP sesuai format frame ADR-018 milik RuView. Lapisan pengolahan berisi server Rust RuView pada single board computer yang melakukan dekoding frame, kalibrasi, ekstraksi motion-band power, dan agregasi indeks aktivitas per window 60 detik. Lapisan penyajian berisi dashboard web dan saluran alert MQTT ke perangkat peternak. Pemisahan tiga lapisan ini menjaga agar penggantian komponen pada satu lapisan tidak merombak lapisan lain.</w:t>
+        <w:t xml:space="preserve">Arsitektur sistem terdiri atas tiga lapisan. Lapisan sensing berisi tiga ESP32 (satu access point, dua station) yang dipasang TX-RX mengapit area kawanan agar geometri antena memotong zona Fresnel area bergerak; ketiganya mengirim frame CSI melalui UDP sesuai format frame ADR-018 milik RuView. Lapisan pengolahan berisi server Rust RuView pada single board computer yang menangani dekoding frame, kalibrasi, ekstraksi motion-band power, dan agregasi indeks aktivitas per window 60 detik. Lapisan penyajian berisi dashboard web dan saluran alert MQTT ke perangkat peternak. Pemisahan tiga lapisan ini menjaga agar penggantian komponen pada satu lapisan tidak merombak lapisan lain.</w:t>
       </w:r>
     </w:p>
     <w:p>
@@ -4017,7 +4017,7 @@
           <w:sz w:val="24"/>
           <w:szCs w:val="24"/>
         </w:rPr>
-        <w:t xml:space="preserve">Dataset disusun dalam blok hari berturut-turut dengan kamera sinkron untuk ground truth dan log kejadian harian (jadwal pakan, cahaya, suhu, kelembapan litter, panen) sebagai kovariat. Evaluasi memakai split blok-waktu, yaitu latih pada hari A sampai B dan uji pada hari C, karena split acak pada data time-series membocorkan informasi dan membuat hasil terlalu optimistis. Seluruh dataset, log, dan kode analisis disimpan terdokumentasi agar dapat dirilis sebagai dataset awal sensing kawanan unggas bila pembimbing menyetujui.</w:t>
+        <w:t xml:space="preserve">Dataset disusun dalam blok hari berturut-turut dengan kamera sinkron untuk ground truth dan log kejadian harian (jadwal pakan, cahaya, suhu, kelembapan litter, panen) sebagai kovariat. Evaluasi memakai split blok waktu, yaitu latih pada hari A sampai B dan uji pada hari C karena split acak pada data time-series membocorkan informasi dan membuat hasil terlalu optimistis. Seluruh dataset, log, dan kode analisis disimpan terdokumentasi agar dapat dirilis sebagai dataset awal sensing kawanan unggas bila pembimbing menyetujui.</w:t>
       </w:r>
     </w:p>
     <w:p>
@@ -4083,7 +4083,7 @@
           <w:sz w:val="24"/>
           <w:szCs w:val="24"/>
         </w:rPr>
-        <w:t xml:space="preserve">Rencana pengujian terdiri atas tiga kelompok yang berurutan. Pengujian pertama adalah uji fisik Delta-CSI pada minggu pertama hingga ketiga: dua ESP32 diposisikan mengapit kandang, lalu amplitudo CSI direkam window 60 detik untuk tiga skenario kandang kosong, satu ayam bergerak, dan kawanan penuh bergerak, ketiganya dibandingkan terhadap noise floor. Pengujian kedua adalah uji indeks aktivitas: energi motion-band diagregasi menjadi indeks per window dan dibandingkan dengan referensi intensitas gerak dari kamera sinkron pada tiap window. Pengujian ketiga adalah uji peringatan: control chart z-score adaptif dijalankan pada data blok hari, dan setiap alarm diaudit terhadap rekaman kamera retrospektif untuk menilai benar-salahnya. Setiap kelompok pengujian menghasilkan tabel hasil dan catatan kejadian yang melekat pada dataset.</w:t>
+        <w:t xml:space="preserve">Rencana pengujian terdiri atas tiga kelompok yang berurutan. Pengujian pertama adalah uji fisik Delta-CSI pada minggu pertama hingga ketiga: dua ESP32 diposisikan mengapit kandang, lalu amplitudo CSI direkam window 60 detik untuk tiga skenario kandang kosong, satu ayam bergerak, dan kawanan penuh bergerak, ketiganya dibandingkan dengan noise floor. Pengujian kedua adalah uji indeks aktivitas: energi motion-band diagregasi menjadi indeks per window dan dibandingkan dengan referensi intensitas gerak dari kamera sinkron pada tiap window. Pengujian ketiga adalah uji peringatan: control chart z-score adaptif dijalankan pada data blok hari, dan setiap alarm diaudit terhadap rekaman kamera retrospektif untuk menilai benar-salahnya. Setiap kelompok pengujian menghasilkan tabel hasil dan catatan kejadian yang melekat pada dataset.</w:t>
       </w:r>
     </w:p>
     <w:p>
@@ -4116,7 +4116,7 @@
           <w:sz w:val="24"/>
           <w:szCs w:val="24"/>
         </w:rPr>
-        <w:t xml:space="preserve">Evaluasi memakai dua jalur yang jujur terhadap kondisi tanpa kelas positif. Jalur utama, yang selalu berjalan, memakai control chart pada indeks aktivitas dengan dua metrik: alarm palsu per 24 jam dengan target paling banyak satu per hari, dan precision@k minimal 0,5 berdasarkan audit kamera retrospektif pada k event teratas. Jalur sekunder hanya berjalan bila event proxy etis berlabel tersedia, memakai F1 minimal 0,70 pada level kawanan dengan split blok-waktu. Target macro F1 di atas 0,80 sengaja tidak dijanjikan karena secara metodologis tidak terdefinisi tanpa minimal 50 event anomali.</w:t>
+        <w:t xml:space="preserve">Evaluasi memakai dua jalur yang jujur terhadap kondisi tanpa kelas positif. Jalur utama, yang selalu berjalan, memakai control chart pada indeks aktivitas dengan dua metrik: alarm palsu per 24 jam dengan target paling banyak satu per hari, dan precision@k minimal 0,5 berdasarkan audit kamera retrospektif pada k event teratas. Jalur sekunder hanya berjalan bila event proxy etis berlabel tersedia, memakai F1 minimal 0,70 pada level kawanan dengan split blok waktu. Target macro F1 di atas 0,80 sengaja tidak dijanjikan karena secara metodologis tidak terdefinisi tanpa minimal 50 event anomali.</w:t>
       </w:r>
     </w:p>
     <w:p>
@@ -4578,7 +4578,7 @@
                 <w:sz w:val="21"/>
                 <w:szCs w:val="21"/>
               </w:rPr>
-              <w:t xml:space="preserve">Ekstraksi fitur amplitudo-only window 60 detik; z-score adaptif + SVM RBF; split blok-waktu (latih A-B, uji C); control chart dan precision@k</w:t>
+              <w:t xml:space="preserve">Ekstraksi fitur amplitudo-only window 60 detik; z-score adaptif + SVM RBF; split blok waktu (latih A-B, uji C); control chart dan precision@k</w:t>
             </w:r>
           </w:p>
         </w:tc>
@@ -4860,7 +4860,7 @@
           <w:sz w:val="24"/>
           <w:szCs w:val="24"/>
         </w:rPr>
-        <w:t xml:space="preserve">Tabel 3.2 merangkum rencana biaya perangkat dan operasional dalam Rupiah. Nilai bersifat estimasi pasar saat penyusunan proposal dan akan disesuaikan saat rekap belanja; platform RuView tidak menimbulkan biaya lisensi karena open-source.</w:t>
+        <w:t xml:space="preserve">Tabel 3.2 merangkum rencana biaya perangkat dan operasional dalam rupiah. Nilai bersifat estimasi pasar saat penyusunan proposal dan akan disesuaikan saat rekap belanja; platform RuView tidak menimbulkan biaya lisensi karena open-source.</w:t>
       </w:r>
     </w:p>
     <w:p>
@@ -5241,7 +5241,7 @@
                 <w:sz w:val="21"/>
                 <w:szCs w:val="21"/>
               </w:rPr>
-              <w:t xml:space="preserve">Housing tertutup, pigtail antena, grounding (anti korosi amonia)</w:t>
+              <w:t xml:space="preserve">Housing tertutup, pigtail antena, grounding (antikorosi amonia)</w:t>
             </w:r>
           </w:p>
         </w:tc>
@@ -5342,7 +5342,7 @@
                 <w:sz w:val="21"/>
                 <w:szCs w:val="21"/>
               </w:rPr>
-              <w:t xml:space="preserve">Kamera/WebCam sinkron untuk ground truth pelabelan</w:t>
+              <w:t xml:space="preserve">Kamera/webcam sinkron untuk ground truth pelabelan</w:t>
             </w:r>
           </w:p>
         </w:tc>
@@ -5757,7 +5757,7 @@
           <w:sz w:val="24"/>
           <w:szCs w:val="24"/>
         </w:rPr>
-        <w:t xml:space="preserve">Tabel 3.3 merangkum risiko utama beserta mitigasinya. Setiap risiko dipasangkan dengan rencana cadangan yang menjaga penelitian tetap menghasilkan temuan, sehingga tidak ada satu pun skenario kegagalan yang mengosongkan skripsi.</w:t>
+        <w:t xml:space="preserve">Tabel 3.3 merangkum risiko utama beserta mitigasinya. Setiap risiko dipasangkan dengan rencana cadangan yang menjaga penelitian tetap menghasilkan temuan sehingga tidak ada satu pun skenario kegagalan yang mengosongkan skripsi.</w:t>
       </w:r>
     </w:p>
     <w:p>
@@ -6202,7 +6202,7 @@
                 <w:sz w:val="21"/>
                 <w:szCs w:val="21"/>
               </w:rPr>
-              <w:t xml:space="preserve">Split blok-waktu dengan validasi antar-hari; klaim dibatasi pada studi kelayakan pada satu konteks</w:t>
+              <w:t xml:space="preserve">Split blok waktu dengan validasi pada hari yang berbeda; klaim dibatasi pada studi kelayakan pada satu konteks</w:t>
             </w:r>
           </w:p>
         </w:tc>

</xml_diff>